<commit_message>
AI disclosure: add the demo video made with Claude, mark presentation details as added
</commit_message>
<xml_diff>
--- a/submission/VITV_Procrastinators_AI_Disclosure.docx
+++ b/submission/VITV_Procrastinators_AI_Disclosure.docx
@@ -325,7 +325,7 @@
           </w:tcPr>
           <w:p>
             <w:r>
-              <w:t>README, presentation text and this disclosure were drafted by the AI.</w:t>
+              <w:t>README, presentation text, this disclosure, and the demo video and its script were made with the AI.</w:t>
             </w:r>
           </w:p>
         </w:tc>
@@ -1872,7 +1872,151 @@
           </w:tcPr>
           <w:p>
             <w:r>
-              <w:t>Team to add names, links and final results.</w:t>
+              <w:t>Team added names, links and final results.</w:t>
+            </w:r>
+          </w:p>
+        </w:tc>
+      </w:tr>
+    </w:tbl>
+    <w:p/>
+    <w:tbl>
+      <w:tblPr>
+        <w:tblStyle w:val="TableGrid"/>
+        <w:tblW w:w="0" w:type="auto"/>
+        <w:tblLook w:val="04A0" w:firstRow="1" w:lastRow="0" w:firstColumn="1" w:lastColumn="0" w:noHBand="0" w:noVBand="1"/>
+      </w:tblPr>
+      <w:tblGrid>
+        <w:gridCol w:w="2592"/>
+        <w:gridCol w:w="7056"/>
+      </w:tblGrid>
+      <w:tr>
+        <w:tc>
+          <w:tcPr>
+            <w:tcW w:w="2592" w:type="dxa"/>
+          </w:tcPr>
+          <w:p>
+            <w:r>
+              <w:t>Feature</w:t>
+            </w:r>
+          </w:p>
+        </w:tc>
+        <w:tc>
+          <w:tcPr>
+            <w:tcW w:w="7056" w:type="dxa"/>
+          </w:tcPr>
+          <w:p>
+            <w:r>
+              <w:t>Demo video</w:t>
+            </w:r>
+          </w:p>
+        </w:tc>
+      </w:tr>
+      <w:tr>
+        <w:tc>
+          <w:tcPr>
+            <w:tcW w:w="2592" w:type="dxa"/>
+          </w:tcPr>
+          <w:p>
+            <w:r>
+              <w:t>Origin</w:t>
+            </w:r>
+          </w:p>
+        </w:tc>
+        <w:tc>
+          <w:tcPr>
+            <w:tcW w:w="7056" w:type="dxa"/>
+          </w:tcPr>
+          <w:p>
+            <w:r>
+              <w:t>AI-Generated</w:t>
+            </w:r>
+          </w:p>
+        </w:tc>
+      </w:tr>
+      <w:tr>
+        <w:tc>
+          <w:tcPr>
+            <w:tcW w:w="2592" w:type="dxa"/>
+          </w:tcPr>
+          <w:p>
+            <w:r>
+              <w:t>Description and AI tool</w:t>
+            </w:r>
+          </w:p>
+        </w:tc>
+        <w:tc>
+          <w:tcPr>
+            <w:tcW w:w="7056" w:type="dxa"/>
+          </w:tcPr>
+          <w:p>
+            <w:r>
+              <w:t>Demo video and its voiceover script, showing the command line demo. Tool: Claude (Anthropic).</w:t>
+            </w:r>
+          </w:p>
+        </w:tc>
+      </w:tr>
+      <w:tr>
+        <w:tc>
+          <w:tcPr>
+            <w:tcW w:w="2592" w:type="dxa"/>
+          </w:tcPr>
+          <w:p>
+            <w:r>
+              <w:t>Prompt (summary)</w:t>
+            </w:r>
+          </w:p>
+        </w:tc>
+        <w:tc>
+          <w:tcPr>
+            <w:tcW w:w="7056" w:type="dxa"/>
+          </w:tcPr>
+          <w:p>
+            <w:r>
+              <w:t>Make a short demo video of the project and a voiceover script for it.</w:t>
+            </w:r>
+          </w:p>
+        </w:tc>
+      </w:tr>
+      <w:tr>
+        <w:tc>
+          <w:tcPr>
+            <w:tcW w:w="2592" w:type="dxa"/>
+          </w:tcPr>
+          <w:p>
+            <w:r>
+              <w:t>Output</w:t>
+            </w:r>
+          </w:p>
+        </w:tc>
+        <w:tc>
+          <w:tcPr>
+            <w:tcW w:w="7056" w:type="dxa"/>
+          </w:tcPr>
+          <w:p>
+            <w:r>
+              <w:t>Demo video (link in the README and the deck)</w:t>
+            </w:r>
+          </w:p>
+        </w:tc>
+      </w:tr>
+      <w:tr>
+        <w:tc>
+          <w:tcPr>
+            <w:tcW w:w="2592" w:type="dxa"/>
+          </w:tcPr>
+          <w:p>
+            <w:r>
+              <w:t>Modification by team</w:t>
+            </w:r>
+          </w:p>
+        </w:tc>
+        <w:tc>
+          <w:tcPr>
+            <w:tcW w:w="7056" w:type="dxa"/>
+          </w:tcPr>
+          <w:p>
+            <w:r>
+              <w:t>Team reviewed the video and its script.</w:t>
             </w:r>
           </w:p>
         </w:tc>

</xml_diff>